<commit_message>
updated 'How to' guides
</commit_message>
<xml_diff>
--- a/man/How_to_Use_the_CPI_Custom_Aggregate_Calculator.docx
+++ b/man/How_to_Use_the_CPI_Custom_Aggregate_Calculator.docx
@@ -91,7 +91,21 @@
           <w:sz w:val="24"/>
           <w:szCs w:val="24"/>
         </w:rPr>
-        <w:t>Statistics Canada regularly publishes 18 “special aggregate” CPI series, such as “All-items excluding food and energy”, which users have requested for many years. You can use the CPI Custom Aggregate Calculator to build a unique CPI series to help isolate the price change for any grouping of CPI products across any published geographic region.</w:t>
+        <w:t xml:space="preserve">Statistics Canada regularly publishes 18 “special aggregate” CPI series, such as “All-items excluding food and energy”, which users have requested for many years. You can </w:t>
+      </w:r>
+      <w:r>
+        <w:rPr>
+          <w:sz w:val="24"/>
+          <w:szCs w:val="24"/>
+        </w:rPr>
+        <w:t xml:space="preserve">now </w:t>
+      </w:r>
+      <w:r>
+        <w:rPr>
+          <w:sz w:val="24"/>
+          <w:szCs w:val="24"/>
+        </w:rPr>
+        <w:t>use the CPI Custom Aggregate Calculator to build a unique CPI series to help isolate the price change for any grouping of CPI products across any published geographic region.</w:t>
       </w:r>
     </w:p>
     <w:p>
@@ -194,7 +208,132 @@
           <w:sz w:val="24"/>
           <w:szCs w:val="24"/>
         </w:rPr>
-        <w:t xml:space="preserve">Step 1. Select whether you want your Custom Aggregate CPI to be built: </w:t>
+        <w:t>When the Calculator launches and you accept the terms of use, it extracts Consumer Price Index</w:t>
+      </w:r>
+      <w:r>
+        <w:rPr>
+          <w:rFonts w:cstheme="minorHAnsi"/>
+          <w:color w:val="000000"/>
+          <w:sz w:val="24"/>
+          <w:szCs w:val="24"/>
+        </w:rPr>
+        <w:t xml:space="preserve"> levels</w:t>
+      </w:r>
+      <w:r>
+        <w:rPr>
+          <w:rFonts w:cstheme="minorHAnsi"/>
+          <w:color w:val="000000"/>
+          <w:sz w:val="24"/>
+          <w:szCs w:val="24"/>
+        </w:rPr>
+        <w:t xml:space="preserve"> and CPI basket weight data from Statistics Canada’s Common Output Data</w:t>
+      </w:r>
+      <w:r>
+        <w:rPr>
+          <w:rFonts w:cstheme="minorHAnsi"/>
+          <w:color w:val="000000"/>
+          <w:sz w:val="24"/>
+          <w:szCs w:val="24"/>
+        </w:rPr>
+        <w:t>base</w:t>
+      </w:r>
+      <w:r>
+        <w:rPr>
+          <w:rFonts w:cstheme="minorHAnsi"/>
+          <w:color w:val="000000"/>
+          <w:sz w:val="24"/>
+          <w:szCs w:val="24"/>
+        </w:rPr>
+        <w:t xml:space="preserve"> Repository (CODR). This takes about 10 seconds, after which the Calculator is ready to generate </w:t>
+      </w:r>
+      <w:r>
+        <w:rPr>
+          <w:rFonts w:cstheme="minorHAnsi"/>
+          <w:color w:val="000000"/>
+          <w:sz w:val="24"/>
+          <w:szCs w:val="24"/>
+        </w:rPr>
+        <w:t>Custom Aggregate</w:t>
+      </w:r>
+      <w:r>
+        <w:rPr>
+          <w:rFonts w:cstheme="minorHAnsi"/>
+          <w:color w:val="000000"/>
+          <w:sz w:val="24"/>
+          <w:szCs w:val="24"/>
+        </w:rPr>
+        <w:t xml:space="preserve"> CPIs for you.</w:t>
+      </w:r>
+      <w:r>
+        <w:rPr>
+          <w:rFonts w:cstheme="minorHAnsi"/>
+          <w:color w:val="000000"/>
+          <w:sz w:val="24"/>
+          <w:szCs w:val="24"/>
+        </w:rPr>
+        <w:t xml:space="preserve"> This guide provides two examples of how to use the Calculator.</w:t>
+      </w:r>
+    </w:p>
+    <w:p>
+      <w:pPr>
+        <w:pStyle w:val="NoSpacing"/>
+        <w:rPr>
+          <w:rFonts w:cstheme="minorHAnsi"/>
+          <w:color w:val="000000"/>
+          <w:sz w:val="24"/>
+          <w:szCs w:val="24"/>
+        </w:rPr>
+      </w:pPr>
+    </w:p>
+    <w:p>
+      <w:pPr>
+        <w:pStyle w:val="NoSpacing"/>
+        <w:rPr>
+          <w:rFonts w:cstheme="minorHAnsi"/>
+          <w:color w:val="000000"/>
+          <w:sz w:val="24"/>
+          <w:szCs w:val="24"/>
+        </w:rPr>
+      </w:pPr>
+      <w:r>
+        <w:rPr>
+          <w:rFonts w:cstheme="minorHAnsi"/>
+          <w:b/>
+          <w:bCs/>
+          <w:color w:val="000000"/>
+          <w:sz w:val="24"/>
+          <w:szCs w:val="24"/>
+        </w:rPr>
+        <w:t>Step 1</w:t>
+      </w:r>
+      <w:r>
+        <w:rPr>
+          <w:rFonts w:cstheme="minorHAnsi"/>
+          <w:color w:val="000000"/>
+          <w:sz w:val="24"/>
+          <w:szCs w:val="24"/>
+        </w:rPr>
+        <w:t xml:space="preserve"> </w:t>
+      </w:r>
+    </w:p>
+    <w:p>
+      <w:pPr>
+        <w:pStyle w:val="NoSpacing"/>
+        <w:rPr>
+          <w:rFonts w:cstheme="minorHAnsi"/>
+          <w:color w:val="000000"/>
+          <w:sz w:val="24"/>
+          <w:szCs w:val="24"/>
+        </w:rPr>
+      </w:pPr>
+      <w:r>
+        <w:rPr>
+          <w:rFonts w:cstheme="minorHAnsi"/>
+          <w:color w:val="000000"/>
+          <w:sz w:val="24"/>
+          <w:szCs w:val="24"/>
+        </w:rPr>
+        <w:t xml:space="preserve">Select whether you want your Custom Aggregate CPI to be built: </w:t>
       </w:r>
     </w:p>
     <w:p>
@@ -296,19 +435,23 @@
         <w:pStyle w:val="NoSpacing"/>
         <w:rPr>
           <w:rFonts w:cstheme="minorHAnsi"/>
-          <w:color w:val="000000"/>
-          <w:sz w:val="24"/>
-          <w:szCs w:val="24"/>
-        </w:rPr>
-      </w:pPr>
-      <w:r>
-        <w:rPr>
-          <w:rFonts w:cstheme="minorHAnsi"/>
-          <w:color w:val="000000"/>
-          <w:sz w:val="24"/>
-          <w:szCs w:val="24"/>
-        </w:rPr>
-        <w:t xml:space="preserve">Step 2. Select one or more component CPI series to build your Custom Aggregate CPI by inclusion or exclusion according to the method chosen at Step 1). </w:t>
+          <w:b/>
+          <w:bCs/>
+          <w:color w:val="000000"/>
+          <w:sz w:val="24"/>
+          <w:szCs w:val="24"/>
+        </w:rPr>
+      </w:pPr>
+      <w:r>
+        <w:rPr>
+          <w:rFonts w:cstheme="minorHAnsi"/>
+          <w:b/>
+          <w:bCs/>
+          <w:color w:val="000000"/>
+          <w:sz w:val="24"/>
+          <w:szCs w:val="24"/>
+        </w:rPr>
+        <w:t>Step 2</w:t>
       </w:r>
     </w:p>
     <w:p>
@@ -321,6 +464,15 @@
           <w:szCs w:val="24"/>
         </w:rPr>
       </w:pPr>
+      <w:r>
+        <w:rPr>
+          <w:rFonts w:cstheme="minorHAnsi"/>
+          <w:color w:val="000000"/>
+          <w:sz w:val="24"/>
+          <w:szCs w:val="24"/>
+        </w:rPr>
+        <w:t xml:space="preserve">Select one or more component CPI series to build your Custom Aggregate CPI by inclusion or exclusion according to the method chosen at Step 1. </w:t>
+      </w:r>
     </w:p>
     <w:p>
       <w:pPr>
@@ -332,15 +484,6 @@
           <w:szCs w:val="24"/>
         </w:rPr>
       </w:pPr>
-      <w:r>
-        <w:rPr>
-          <w:rFonts w:cstheme="minorHAnsi"/>
-          <w:color w:val="000000"/>
-          <w:sz w:val="24"/>
-          <w:szCs w:val="24"/>
-        </w:rPr>
-        <w:t>Step 3. Set your Custom Aggregate index base period.</w:t>
-      </w:r>
     </w:p>
     <w:p>
       <w:pPr>
@@ -352,6 +495,222 @@
           <w:szCs w:val="24"/>
         </w:rPr>
       </w:pPr>
+      <w:r>
+        <w:rPr>
+          <w:rFonts w:cstheme="minorHAnsi"/>
+          <w:color w:val="000000"/>
+          <w:sz w:val="24"/>
+          <w:szCs w:val="24"/>
+        </w:rPr>
+        <w:t>You can start with a “</w:t>
+      </w:r>
+      <w:r>
+        <w:rPr>
+          <w:rFonts w:cstheme="minorHAnsi"/>
+          <w:color w:val="000000"/>
+          <w:sz w:val="24"/>
+          <w:szCs w:val="24"/>
+        </w:rPr>
+        <w:t>p</w:t>
+      </w:r>
+      <w:r>
+        <w:rPr>
+          <w:rFonts w:cstheme="minorHAnsi"/>
+          <w:color w:val="000000"/>
+          <w:sz w:val="24"/>
+          <w:szCs w:val="24"/>
+        </w:rPr>
+        <w:t>opular aggregat</w:t>
+      </w:r>
+      <w:r>
+        <w:rPr>
+          <w:rFonts w:cstheme="minorHAnsi"/>
+          <w:color w:val="000000"/>
+          <w:sz w:val="24"/>
+          <w:szCs w:val="24"/>
+        </w:rPr>
+        <w:t>ion</w:t>
+      </w:r>
+      <w:r>
+        <w:rPr>
+          <w:rFonts w:cstheme="minorHAnsi"/>
+          <w:color w:val="000000"/>
+          <w:sz w:val="24"/>
+          <w:szCs w:val="24"/>
+        </w:rPr>
+        <w:t xml:space="preserve">” by selecting a </w:t>
+      </w:r>
+      <w:r>
+        <w:rPr>
+          <w:rFonts w:cstheme="minorHAnsi"/>
+          <w:color w:val="000000"/>
+          <w:sz w:val="24"/>
+          <w:szCs w:val="24"/>
+        </w:rPr>
+        <w:t>p</w:t>
+      </w:r>
+      <w:r>
+        <w:rPr>
+          <w:rFonts w:cstheme="minorHAnsi"/>
+          <w:color w:val="000000"/>
+          <w:sz w:val="24"/>
+          <w:szCs w:val="24"/>
+        </w:rPr>
+        <w:t>opular aggregate Geography</w:t>
+      </w:r>
+      <w:r>
+        <w:rPr>
+          <w:rFonts w:cstheme="minorHAnsi"/>
+          <w:color w:val="000000"/>
+          <w:sz w:val="24"/>
+          <w:szCs w:val="24"/>
+        </w:rPr>
+        <w:t xml:space="preserve">, </w:t>
+      </w:r>
+      <w:r>
+        <w:rPr>
+          <w:rFonts w:cstheme="minorHAnsi"/>
+          <w:color w:val="000000"/>
+          <w:sz w:val="24"/>
+          <w:szCs w:val="24"/>
+        </w:rPr>
+        <w:t xml:space="preserve">then a </w:t>
+      </w:r>
+      <w:r>
+        <w:rPr>
+          <w:rFonts w:cstheme="minorHAnsi"/>
+          <w:color w:val="000000"/>
+          <w:sz w:val="24"/>
+          <w:szCs w:val="24"/>
+        </w:rPr>
+        <w:t>p</w:t>
+      </w:r>
+      <w:r>
+        <w:rPr>
+          <w:rFonts w:cstheme="minorHAnsi"/>
+          <w:color w:val="000000"/>
+          <w:sz w:val="24"/>
+          <w:szCs w:val="24"/>
+        </w:rPr>
+        <w:t xml:space="preserve">opular aggregate Product group, </w:t>
+      </w:r>
+      <w:r>
+        <w:rPr>
+          <w:rFonts w:cstheme="minorHAnsi"/>
+          <w:color w:val="000000"/>
+          <w:sz w:val="24"/>
+          <w:szCs w:val="24"/>
+        </w:rPr>
+        <w:t xml:space="preserve">and </w:t>
+      </w:r>
+      <w:r>
+        <w:rPr>
+          <w:rFonts w:cstheme="minorHAnsi"/>
+          <w:color w:val="000000"/>
+          <w:sz w:val="24"/>
+          <w:szCs w:val="24"/>
+        </w:rPr>
+        <w:t>then select</w:t>
+      </w:r>
+      <w:r>
+        <w:rPr>
+          <w:rFonts w:cstheme="minorHAnsi"/>
+          <w:color w:val="000000"/>
+          <w:sz w:val="24"/>
+          <w:szCs w:val="24"/>
+        </w:rPr>
+        <w:t>ing</w:t>
+      </w:r>
+      <w:r>
+        <w:rPr>
+          <w:rFonts w:cstheme="minorHAnsi"/>
+          <w:color w:val="000000"/>
+          <w:sz w:val="24"/>
+          <w:szCs w:val="24"/>
+        </w:rPr>
+        <w:t xml:space="preserve"> “Apply”. This will pre-fill </w:t>
+      </w:r>
+      <w:r>
+        <w:rPr>
+          <w:rFonts w:cstheme="minorHAnsi"/>
+          <w:color w:val="000000"/>
+          <w:sz w:val="24"/>
+          <w:szCs w:val="24"/>
+        </w:rPr>
+        <w:t xml:space="preserve">the </w:t>
+      </w:r>
+      <w:r>
+        <w:rPr>
+          <w:rFonts w:cstheme="minorHAnsi"/>
+          <w:color w:val="000000"/>
+          <w:sz w:val="24"/>
+          <w:szCs w:val="24"/>
+        </w:rPr>
+        <w:t>individual</w:t>
+      </w:r>
+      <w:r>
+        <w:rPr>
+          <w:rFonts w:cstheme="minorHAnsi"/>
+          <w:color w:val="000000"/>
+          <w:sz w:val="24"/>
+          <w:szCs w:val="24"/>
+        </w:rPr>
+        <w:t xml:space="preserve"> component series </w:t>
+      </w:r>
+      <w:r>
+        <w:rPr>
+          <w:rFonts w:cstheme="minorHAnsi"/>
+          <w:color w:val="000000"/>
+          <w:sz w:val="24"/>
+          <w:szCs w:val="24"/>
+        </w:rPr>
+        <w:t>based on the composition of</w:t>
+      </w:r>
+      <w:r>
+        <w:rPr>
+          <w:rFonts w:cstheme="minorHAnsi"/>
+          <w:color w:val="000000"/>
+          <w:sz w:val="24"/>
+          <w:szCs w:val="24"/>
+        </w:rPr>
+        <w:t xml:space="preserve"> the </w:t>
+      </w:r>
+      <w:r>
+        <w:rPr>
+          <w:rFonts w:cstheme="minorHAnsi"/>
+          <w:color w:val="000000"/>
+          <w:sz w:val="24"/>
+          <w:szCs w:val="24"/>
+        </w:rPr>
+        <w:t>p</w:t>
+      </w:r>
+      <w:r>
+        <w:rPr>
+          <w:rFonts w:cstheme="minorHAnsi"/>
+          <w:color w:val="000000"/>
+          <w:sz w:val="24"/>
+          <w:szCs w:val="24"/>
+        </w:rPr>
+        <w:t xml:space="preserve">opular </w:t>
+      </w:r>
+      <w:r>
+        <w:rPr>
+          <w:rFonts w:cstheme="minorHAnsi"/>
+          <w:color w:val="000000"/>
+          <w:sz w:val="24"/>
+          <w:szCs w:val="24"/>
+        </w:rPr>
+        <w:t>aggregation</w:t>
+      </w:r>
+      <w:r>
+        <w:rPr>
+          <w:rFonts w:cstheme="minorHAnsi"/>
+          <w:color w:val="000000"/>
+          <w:sz w:val="24"/>
+          <w:szCs w:val="24"/>
+        </w:rPr>
+        <w:t xml:space="preserve">. You could then customize your components by selecting “Remove” or “Add”. </w:t>
+      </w:r>
     </w:p>
     <w:p>
       <w:pPr>
@@ -363,15 +722,6 @@
           <w:szCs w:val="24"/>
         </w:rPr>
       </w:pPr>
-      <w:r>
-        <w:rPr>
-          <w:rFonts w:cstheme="minorHAnsi"/>
-          <w:color w:val="000000"/>
-          <w:sz w:val="24"/>
-          <w:szCs w:val="24"/>
-        </w:rPr>
-        <w:t>Select “Calculate” at Step 4 when you are ready to calculate your Custom Aggregate CPI.</w:t>
-      </w:r>
     </w:p>
     <w:p>
       <w:pPr>
@@ -383,6 +733,51 @@
           <w:szCs w:val="24"/>
         </w:rPr>
       </w:pPr>
+      <w:r>
+        <w:rPr>
+          <w:rFonts w:cstheme="minorHAnsi"/>
+          <w:color w:val="000000"/>
+          <w:sz w:val="24"/>
+          <w:szCs w:val="24"/>
+        </w:rPr>
+        <w:t xml:space="preserve">If you prefer, you can skip the </w:t>
+      </w:r>
+      <w:r>
+        <w:rPr>
+          <w:rFonts w:cstheme="minorHAnsi"/>
+          <w:color w:val="000000"/>
+          <w:sz w:val="24"/>
+          <w:szCs w:val="24"/>
+        </w:rPr>
+        <w:t xml:space="preserve">popular aggregation </w:t>
+      </w:r>
+      <w:r>
+        <w:rPr>
+          <w:rFonts w:cstheme="minorHAnsi"/>
+          <w:color w:val="000000"/>
+          <w:sz w:val="24"/>
+          <w:szCs w:val="24"/>
+        </w:rPr>
+        <w:t>option and select your components one at a time. First enter a Geography, then a Product, and select “Remove”, “Add” or “Restart” if needed</w:t>
+      </w:r>
+      <w:r>
+        <w:rPr>
+          <w:rFonts w:cstheme="minorHAnsi"/>
+          <w:color w:val="000000"/>
+          <w:sz w:val="24"/>
+          <w:szCs w:val="24"/>
+        </w:rPr>
+        <w:t xml:space="preserve"> until you have the desired components to include or exclude</w:t>
+      </w:r>
+      <w:r>
+        <w:rPr>
+          <w:rFonts w:cstheme="minorHAnsi"/>
+          <w:color w:val="000000"/>
+          <w:sz w:val="24"/>
+          <w:szCs w:val="24"/>
+        </w:rPr>
+        <w:t>.</w:t>
+      </w:r>
     </w:p>
     <w:p>
       <w:pPr>
@@ -394,14 +789,189 @@
           <w:szCs w:val="24"/>
         </w:rPr>
       </w:pPr>
-      <w:r>
-        <w:rPr>
-          <w:rFonts w:cstheme="minorHAnsi"/>
-          <w:color w:val="000000"/>
-          <w:sz w:val="24"/>
-          <w:szCs w:val="24"/>
-        </w:rPr>
-        <w:t>The calculator will display a graph and table for your Custom Aggregate CPIs for each of the following statistics:</w:t>
+    </w:p>
+    <w:p>
+      <w:pPr>
+        <w:pStyle w:val="NoSpacing"/>
+        <w:rPr>
+          <w:rFonts w:cstheme="minorHAnsi"/>
+          <w:b/>
+          <w:bCs/>
+          <w:color w:val="000000"/>
+          <w:sz w:val="24"/>
+          <w:szCs w:val="24"/>
+        </w:rPr>
+      </w:pPr>
+      <w:r>
+        <w:rPr>
+          <w:rFonts w:cstheme="minorHAnsi"/>
+          <w:b/>
+          <w:bCs/>
+          <w:color w:val="000000"/>
+          <w:sz w:val="24"/>
+          <w:szCs w:val="24"/>
+        </w:rPr>
+        <w:t>Step 3</w:t>
+      </w:r>
+    </w:p>
+    <w:p>
+      <w:pPr>
+        <w:pStyle w:val="NoSpacing"/>
+        <w:rPr>
+          <w:rFonts w:cstheme="minorHAnsi"/>
+          <w:color w:val="000000"/>
+          <w:sz w:val="24"/>
+          <w:szCs w:val="24"/>
+        </w:rPr>
+      </w:pPr>
+      <w:r>
+        <w:rPr>
+          <w:rFonts w:cstheme="minorHAnsi"/>
+          <w:color w:val="000000"/>
+          <w:sz w:val="24"/>
+          <w:szCs w:val="24"/>
+        </w:rPr>
+        <w:t>Set your Custom Aggregate index base period</w:t>
+      </w:r>
+      <w:r>
+        <w:rPr>
+          <w:rFonts w:cstheme="minorHAnsi"/>
+          <w:color w:val="000000"/>
+          <w:sz w:val="24"/>
+          <w:szCs w:val="24"/>
+        </w:rPr>
+        <w:t>, the period for which the average index level equals 100</w:t>
+      </w:r>
+      <w:r>
+        <w:rPr>
+          <w:rFonts w:cstheme="minorHAnsi"/>
+          <w:color w:val="000000"/>
+          <w:sz w:val="24"/>
+          <w:szCs w:val="24"/>
+        </w:rPr>
+        <w:t>.</w:t>
+      </w:r>
+    </w:p>
+    <w:p>
+      <w:pPr>
+        <w:pStyle w:val="NoSpacing"/>
+        <w:rPr>
+          <w:rFonts w:cstheme="minorHAnsi"/>
+          <w:color w:val="000000"/>
+          <w:sz w:val="24"/>
+          <w:szCs w:val="24"/>
+        </w:rPr>
+      </w:pPr>
+    </w:p>
+    <w:p>
+      <w:pPr>
+        <w:pStyle w:val="NoSpacing"/>
+        <w:rPr>
+          <w:rFonts w:cstheme="minorHAnsi"/>
+          <w:b/>
+          <w:bCs/>
+          <w:color w:val="000000"/>
+          <w:sz w:val="24"/>
+          <w:szCs w:val="24"/>
+        </w:rPr>
+      </w:pPr>
+      <w:r>
+        <w:rPr>
+          <w:rFonts w:cstheme="minorHAnsi"/>
+          <w:b/>
+          <w:bCs/>
+          <w:color w:val="000000"/>
+          <w:sz w:val="24"/>
+          <w:szCs w:val="24"/>
+        </w:rPr>
+        <w:t>Step 4</w:t>
+      </w:r>
+    </w:p>
+    <w:p>
+      <w:pPr>
+        <w:pStyle w:val="NoSpacing"/>
+        <w:rPr>
+          <w:rFonts w:cstheme="minorHAnsi"/>
+          <w:color w:val="000000"/>
+          <w:sz w:val="24"/>
+          <w:szCs w:val="24"/>
+        </w:rPr>
+      </w:pPr>
+      <w:r>
+        <w:rPr>
+          <w:rFonts w:cstheme="minorHAnsi"/>
+          <w:color w:val="000000"/>
+          <w:sz w:val="24"/>
+          <w:szCs w:val="24"/>
+        </w:rPr>
+        <w:t>Select “Calculate” when you are ready to calculate your Custom Aggregate CPI.</w:t>
+      </w:r>
+      <w:r>
+        <w:rPr>
+          <w:rFonts w:cstheme="minorHAnsi"/>
+          <w:color w:val="000000"/>
+          <w:sz w:val="24"/>
+          <w:szCs w:val="24"/>
+        </w:rPr>
+        <w:t xml:space="preserve"> </w:t>
+      </w:r>
+      <w:r>
+        <w:rPr>
+          <w:rFonts w:cstheme="minorHAnsi"/>
+          <w:color w:val="000000"/>
+          <w:sz w:val="24"/>
+          <w:szCs w:val="24"/>
+        </w:rPr>
+        <w:t>Custom Aggregate indexes are available starting 2007-04, the link month for the 2005 basket weights.</w:t>
+      </w:r>
+    </w:p>
+    <w:p>
+      <w:pPr>
+        <w:pStyle w:val="NoSpacing"/>
+        <w:rPr>
+          <w:rFonts w:cstheme="minorHAnsi"/>
+          <w:color w:val="000000"/>
+          <w:sz w:val="24"/>
+          <w:szCs w:val="24"/>
+        </w:rPr>
+      </w:pPr>
+    </w:p>
+    <w:p>
+      <w:pPr>
+        <w:pStyle w:val="NoSpacing"/>
+        <w:rPr>
+          <w:rFonts w:cstheme="minorHAnsi"/>
+          <w:color w:val="000000"/>
+          <w:sz w:val="24"/>
+          <w:szCs w:val="24"/>
+        </w:rPr>
+      </w:pPr>
+      <w:r>
+        <w:rPr>
+          <w:rFonts w:cstheme="minorHAnsi"/>
+          <w:color w:val="000000"/>
+          <w:sz w:val="24"/>
+          <w:szCs w:val="24"/>
+        </w:rPr>
+        <w:t>After a few seconds</w:t>
+      </w:r>
+      <w:r>
+        <w:rPr>
+          <w:rFonts w:cstheme="minorHAnsi"/>
+          <w:color w:val="000000"/>
+          <w:sz w:val="24"/>
+          <w:szCs w:val="24"/>
+        </w:rPr>
+        <w:t>, the Calculator</w:t>
+      </w:r>
+      <w:r>
+        <w:rPr>
+          <w:rFonts w:cstheme="minorHAnsi"/>
+          <w:color w:val="000000"/>
+          <w:sz w:val="24"/>
+          <w:szCs w:val="24"/>
+        </w:rPr>
+        <w:t xml:space="preserve"> will display a graph and table for your Custom Aggregate CPIs for each of the following statistics:</w:t>
       </w:r>
     </w:p>
     <w:p>
@@ -425,7 +995,6 @@
           <w:sz w:val="24"/>
           <w:szCs w:val="24"/>
         </w:rPr>
-        <w:lastRenderedPageBreak/>
         <w:t>Index 12-month % change</w:t>
       </w:r>
     </w:p>
@@ -576,7 +1145,6 @@
     <w:p>
       <w:pPr>
         <w:pStyle w:val="NoSpacing"/>
-        <w:ind w:firstLine="360"/>
         <w:rPr>
           <w:rFonts w:cstheme="minorHAnsi"/>
           <w:color w:val="000000"/>
@@ -588,64 +1156,821 @@
     <w:p>
       <w:pPr>
         <w:pStyle w:val="NoSpacing"/>
-        <w:ind w:firstLine="360"/>
-        <w:rPr>
-          <w:rFonts w:cstheme="minorHAnsi"/>
-          <w:color w:val="000000"/>
-          <w:sz w:val="24"/>
-          <w:szCs w:val="24"/>
-        </w:rPr>
-      </w:pPr>
+        <w:rPr>
+          <w:rFonts w:cstheme="minorHAnsi"/>
+          <w:color w:val="000000"/>
+          <w:sz w:val="24"/>
+          <w:szCs w:val="24"/>
+        </w:rPr>
+      </w:pPr>
+      <w:r>
+        <w:rPr>
+          <w:rFonts w:cstheme="minorHAnsi"/>
+          <w:color w:val="000000"/>
+          <w:sz w:val="24"/>
+          <w:szCs w:val="24"/>
+        </w:rPr>
+        <w:t>You can then perform several further actions.</w:t>
+      </w:r>
     </w:p>
     <w:p>
       <w:pPr>
         <w:pStyle w:val="NoSpacing"/>
-        <w:rPr>
-          <w:rFonts w:cstheme="minorHAnsi"/>
-          <w:color w:val="000000"/>
-          <w:sz w:val="24"/>
-          <w:szCs w:val="24"/>
-        </w:rPr>
-      </w:pPr>
-      <w:r>
-        <w:rPr>
-          <w:rFonts w:cstheme="minorHAnsi"/>
-          <w:color w:val="000000"/>
-          <w:sz w:val="24"/>
-          <w:szCs w:val="24"/>
-        </w:rPr>
-        <w:t>Custom Aggregate indexes are available starting 2007-04, the link month for the 2005 basket weights.</w:t>
+        <w:numPr>
+          <w:ilvl w:val="0"/>
+          <w:numId w:val="45"/>
+        </w:numPr>
+        <w:rPr>
+          <w:rFonts w:cstheme="minorHAnsi"/>
+          <w:color w:val="000000"/>
+          <w:sz w:val="24"/>
+          <w:szCs w:val="24"/>
+        </w:rPr>
+      </w:pPr>
+      <w:r>
+        <w:rPr>
+          <w:rFonts w:cstheme="minorHAnsi"/>
+          <w:color w:val="000000"/>
+          <w:sz w:val="24"/>
+          <w:szCs w:val="24"/>
+        </w:rPr>
+        <w:t>You can check the status of the calculation</w:t>
+      </w:r>
+      <w:r>
+        <w:rPr>
+          <w:rFonts w:cstheme="minorHAnsi"/>
+          <w:color w:val="000000"/>
+          <w:sz w:val="24"/>
+          <w:szCs w:val="24"/>
+        </w:rPr>
+        <w:t xml:space="preserve"> and details for each Custom Aggregate</w:t>
+      </w:r>
+      <w:r>
+        <w:rPr>
+          <w:rFonts w:cstheme="minorHAnsi"/>
+          <w:color w:val="000000"/>
+          <w:sz w:val="24"/>
+          <w:szCs w:val="24"/>
+        </w:rPr>
+        <w:t xml:space="preserve"> under “Results of last run</w:t>
+      </w:r>
+      <w:r>
+        <w:rPr>
+          <w:rFonts w:cstheme="minorHAnsi"/>
+          <w:color w:val="000000"/>
+          <w:sz w:val="24"/>
+          <w:szCs w:val="24"/>
+        </w:rPr>
+        <w:t>”</w:t>
+      </w:r>
+      <w:r>
+        <w:rPr>
+          <w:rFonts w:cstheme="minorHAnsi"/>
+          <w:color w:val="000000"/>
+          <w:sz w:val="24"/>
+          <w:szCs w:val="24"/>
+        </w:rPr>
+        <w:t>.</w:t>
       </w:r>
     </w:p>
     <w:p>
       <w:pPr>
         <w:pStyle w:val="NoSpacing"/>
-        <w:rPr>
-          <w:rFonts w:cstheme="minorHAnsi"/>
-          <w:color w:val="000000"/>
-          <w:sz w:val="24"/>
-          <w:szCs w:val="24"/>
-        </w:rPr>
-      </w:pPr>
+        <w:numPr>
+          <w:ilvl w:val="0"/>
+          <w:numId w:val="45"/>
+        </w:numPr>
+        <w:rPr>
+          <w:rFonts w:cstheme="minorHAnsi"/>
+          <w:color w:val="000000"/>
+          <w:sz w:val="24"/>
+          <w:szCs w:val="24"/>
+        </w:rPr>
+      </w:pPr>
+      <w:r>
+        <w:rPr>
+          <w:rFonts w:cstheme="minorHAnsi"/>
+          <w:color w:val="000000"/>
+          <w:sz w:val="24"/>
+          <w:szCs w:val="24"/>
+        </w:rPr>
+        <w:t>Select “Collapse” to collapse a detailed box, or “Expand” to view details.</w:t>
+      </w:r>
     </w:p>
     <w:p>
       <w:pPr>
         <w:pStyle w:val="NoSpacing"/>
-        <w:rPr>
-          <w:rFonts w:cstheme="minorHAnsi"/>
-          <w:color w:val="000000"/>
-          <w:sz w:val="24"/>
-          <w:szCs w:val="24"/>
-        </w:rPr>
-      </w:pPr>
-      <w:r>
-        <w:rPr>
-          <w:rFonts w:cstheme="minorHAnsi"/>
-          <w:color w:val="000000"/>
-          <w:sz w:val="24"/>
-          <w:szCs w:val="24"/>
-        </w:rPr>
-        <w:t>Tip</w:t>
+        <w:numPr>
+          <w:ilvl w:val="0"/>
+          <w:numId w:val="45"/>
+        </w:numPr>
+        <w:rPr>
+          <w:rFonts w:cstheme="minorHAnsi"/>
+          <w:color w:val="000000"/>
+          <w:sz w:val="24"/>
+          <w:szCs w:val="24"/>
+        </w:rPr>
+      </w:pPr>
+      <w:r>
+        <w:rPr>
+          <w:rFonts w:cstheme="minorHAnsi"/>
+          <w:color w:val="000000"/>
+          <w:sz w:val="24"/>
+          <w:szCs w:val="24"/>
+        </w:rPr>
+        <w:t>Under “Rebase options”, you can choose whether to rebase your comparison series to get all series on a common time reference period.</w:t>
+      </w:r>
+    </w:p>
+    <w:p>
+      <w:pPr>
+        <w:pStyle w:val="NoSpacing"/>
+        <w:numPr>
+          <w:ilvl w:val="0"/>
+          <w:numId w:val="45"/>
+        </w:numPr>
+        <w:rPr>
+          <w:rFonts w:cstheme="minorHAnsi"/>
+          <w:color w:val="000000"/>
+          <w:sz w:val="24"/>
+          <w:szCs w:val="24"/>
+        </w:rPr>
+      </w:pPr>
+      <w:r>
+        <w:rPr>
+          <w:rFonts w:cstheme="minorHAnsi"/>
+          <w:color w:val="000000"/>
+          <w:sz w:val="24"/>
+          <w:szCs w:val="24"/>
+        </w:rPr>
+        <w:t>Under “Series display options”, select which Custom Aggregate, comparison and component series you would like to display.</w:t>
+      </w:r>
+    </w:p>
+    <w:p>
+      <w:pPr>
+        <w:pStyle w:val="NoSpacing"/>
+        <w:numPr>
+          <w:ilvl w:val="0"/>
+          <w:numId w:val="45"/>
+        </w:numPr>
+        <w:rPr>
+          <w:rFonts w:cstheme="minorHAnsi"/>
+          <w:color w:val="000000"/>
+          <w:sz w:val="24"/>
+          <w:szCs w:val="24"/>
+        </w:rPr>
+      </w:pPr>
+      <w:r>
+        <w:rPr>
+          <w:rFonts w:cstheme="minorHAnsi"/>
+          <w:color w:val="000000"/>
+          <w:sz w:val="24"/>
+          <w:szCs w:val="24"/>
+        </w:rPr>
+        <w:t>You can a</w:t>
+      </w:r>
+      <w:r>
+        <w:rPr>
+          <w:rFonts w:cstheme="minorHAnsi"/>
+          <w:color w:val="000000"/>
+          <w:sz w:val="24"/>
+          <w:szCs w:val="24"/>
+        </w:rPr>
+        <w:t>djust the graph time range by moving the graph sliders.</w:t>
+      </w:r>
+    </w:p>
+    <w:p>
+      <w:pPr>
+        <w:pStyle w:val="NoSpacing"/>
+        <w:numPr>
+          <w:ilvl w:val="0"/>
+          <w:numId w:val="45"/>
+        </w:numPr>
+        <w:rPr>
+          <w:rFonts w:cstheme="minorHAnsi"/>
+          <w:color w:val="000000"/>
+          <w:sz w:val="24"/>
+          <w:szCs w:val="24"/>
+        </w:rPr>
+      </w:pPr>
+      <w:r>
+        <w:rPr>
+          <w:rFonts w:cstheme="minorHAnsi"/>
+          <w:color w:val="000000"/>
+          <w:sz w:val="24"/>
+          <w:szCs w:val="24"/>
+        </w:rPr>
+        <w:t>You can select “Save graph” and “Download table” to save your results locally.</w:t>
+      </w:r>
+    </w:p>
+    <w:p>
+      <w:pPr>
+        <w:rPr>
+          <w:rFonts w:cstheme="minorHAnsi"/>
+          <w:color w:val="000000"/>
+          <w:sz w:val="24"/>
+          <w:szCs w:val="24"/>
+        </w:rPr>
+      </w:pPr>
+    </w:p>
+    <w:p>
+      <w:pPr>
+        <w:pStyle w:val="Heading1"/>
+      </w:pPr>
+      <w:r>
+        <w:t>Example</w:t>
+      </w:r>
+      <w:r>
+        <w:t xml:space="preserve"> 1</w:t>
+      </w:r>
+    </w:p>
+    <w:p>
+      <w:pPr>
+        <w:pStyle w:val="NoSpacing"/>
+        <w:rPr>
+          <w:sz w:val="24"/>
+          <w:szCs w:val="24"/>
+        </w:rPr>
+      </w:pPr>
+      <w:r>
+        <w:rPr>
+          <w:rFonts w:cstheme="minorHAnsi"/>
+          <w:color w:val="000000"/>
+          <w:sz w:val="24"/>
+          <w:szCs w:val="24"/>
+        </w:rPr>
+        <w:t xml:space="preserve">As an example, you may be interested in calculating </w:t>
+      </w:r>
+      <w:r>
+        <w:rPr>
+          <w:sz w:val="24"/>
+          <w:szCs w:val="24"/>
+        </w:rPr>
+        <w:t>an All-items Canada CPI excluding carbon-related energy goods to assess price trends with and without these goods in the CPI basket.</w:t>
+      </w:r>
+    </w:p>
+    <w:p>
+      <w:pPr>
+        <w:pStyle w:val="NoSpacing"/>
+        <w:rPr>
+          <w:sz w:val="24"/>
+          <w:szCs w:val="24"/>
+        </w:rPr>
+      </w:pPr>
+    </w:p>
+    <w:p>
+      <w:pPr>
+        <w:pStyle w:val="NoSpacing"/>
+        <w:rPr>
+          <w:rFonts w:cstheme="minorHAnsi"/>
+          <w:color w:val="000000"/>
+          <w:sz w:val="24"/>
+          <w:szCs w:val="24"/>
+        </w:rPr>
+      </w:pPr>
+      <w:r>
+        <w:rPr>
+          <w:sz w:val="24"/>
+          <w:szCs w:val="24"/>
+        </w:rPr>
+        <w:t xml:space="preserve">At Step 1, </w:t>
+      </w:r>
+      <w:r>
+        <w:rPr>
+          <w:rFonts w:cstheme="minorHAnsi"/>
+          <w:color w:val="000000"/>
+          <w:sz w:val="24"/>
+          <w:szCs w:val="24"/>
+        </w:rPr>
+        <w:t xml:space="preserve">select </w:t>
+      </w:r>
+      <w:r>
+        <w:rPr>
+          <w:rFonts w:cstheme="minorHAnsi"/>
+          <w:color w:val="000000"/>
+          <w:sz w:val="24"/>
+          <w:szCs w:val="24"/>
+        </w:rPr>
+        <w:t>“The All-items CPI excluding the selected component CPI series”, or “Both of the above”.</w:t>
+      </w:r>
+    </w:p>
+    <w:p>
+      <w:pPr>
+        <w:pStyle w:val="NoSpacing"/>
+        <w:rPr>
+          <w:rFonts w:cstheme="minorHAnsi"/>
+          <w:color w:val="000000"/>
+          <w:sz w:val="24"/>
+          <w:szCs w:val="24"/>
+        </w:rPr>
+      </w:pPr>
+    </w:p>
+    <w:p>
+      <w:pPr>
+        <w:pStyle w:val="NoSpacing"/>
+        <w:rPr>
+          <w:rFonts w:cstheme="minorHAnsi"/>
+          <w:color w:val="000000"/>
+          <w:sz w:val="24"/>
+          <w:szCs w:val="24"/>
+        </w:rPr>
+      </w:pPr>
+      <w:r>
+        <w:rPr>
+          <w:rFonts w:cstheme="minorHAnsi"/>
+          <w:color w:val="000000"/>
+          <w:sz w:val="24"/>
+          <w:szCs w:val="24"/>
+        </w:rPr>
+        <w:t>A</w:t>
+      </w:r>
+      <w:r>
+        <w:rPr>
+          <w:rFonts w:cstheme="minorHAnsi"/>
+          <w:color w:val="000000"/>
+          <w:sz w:val="24"/>
+          <w:szCs w:val="24"/>
+        </w:rPr>
+        <w:t>t Step 2, select</w:t>
+      </w:r>
+      <w:r>
+        <w:rPr>
+          <w:rFonts w:cstheme="minorHAnsi"/>
+          <w:color w:val="000000"/>
+          <w:sz w:val="24"/>
+          <w:szCs w:val="24"/>
+        </w:rPr>
+        <w:t>, under “Start by showing component geographies and products for a popular aggregation”, select</w:t>
+      </w:r>
+      <w:r>
+        <w:rPr>
+          <w:rFonts w:cstheme="minorHAnsi"/>
+          <w:color w:val="000000"/>
+          <w:sz w:val="24"/>
+          <w:szCs w:val="24"/>
+        </w:rPr>
+        <w:t xml:space="preserve"> </w:t>
+      </w:r>
+      <w:r>
+        <w:rPr>
+          <w:rFonts w:cstheme="minorHAnsi"/>
+          <w:color w:val="000000"/>
+          <w:sz w:val="24"/>
+          <w:szCs w:val="24"/>
+        </w:rPr>
+        <w:t xml:space="preserve">Geography = </w:t>
+      </w:r>
+      <w:r>
+        <w:rPr>
+          <w:rFonts w:cstheme="minorHAnsi"/>
+          <w:color w:val="000000"/>
+          <w:sz w:val="24"/>
+          <w:szCs w:val="24"/>
+        </w:rPr>
+        <w:t xml:space="preserve">“Canada”, then </w:t>
+      </w:r>
+      <w:r>
+        <w:rPr>
+          <w:rFonts w:cstheme="minorHAnsi"/>
+          <w:color w:val="000000"/>
+          <w:sz w:val="24"/>
+          <w:szCs w:val="24"/>
+        </w:rPr>
+        <w:t xml:space="preserve">Product group = </w:t>
+      </w:r>
+      <w:r>
+        <w:rPr>
+          <w:rFonts w:cstheme="minorHAnsi"/>
+          <w:color w:val="000000"/>
+          <w:sz w:val="24"/>
+          <w:szCs w:val="24"/>
+        </w:rPr>
+        <w:t>“Energy”</w:t>
+      </w:r>
+      <w:r>
+        <w:rPr>
+          <w:rFonts w:cstheme="minorHAnsi"/>
+          <w:color w:val="000000"/>
+          <w:sz w:val="24"/>
+          <w:szCs w:val="24"/>
+        </w:rPr>
+        <w:t>, and then “Apply”. This will prefill the individual component CPI series. To view primarily carbon-based goods, select “Remove” next to the component “Canada”, “Electricity”.</w:t>
+      </w:r>
+    </w:p>
+    <w:p>
+      <w:pPr>
+        <w:pStyle w:val="NoSpacing"/>
+        <w:rPr>
+          <w:rFonts w:cstheme="minorHAnsi"/>
+          <w:color w:val="000000"/>
+          <w:sz w:val="24"/>
+          <w:szCs w:val="24"/>
+        </w:rPr>
+      </w:pPr>
+    </w:p>
+    <w:p>
+      <w:pPr>
+        <w:pStyle w:val="NoSpacing"/>
+        <w:rPr>
+          <w:rFonts w:cstheme="minorHAnsi"/>
+          <w:color w:val="000000"/>
+          <w:sz w:val="24"/>
+          <w:szCs w:val="24"/>
+        </w:rPr>
+      </w:pPr>
+      <w:r>
+        <w:rPr>
+          <w:rFonts w:cstheme="minorHAnsi"/>
+          <w:color w:val="000000"/>
+          <w:sz w:val="24"/>
+          <w:szCs w:val="24"/>
+        </w:rPr>
+        <w:t>At Step 3, select a base period, or leave it at 2007-04 = 100.</w:t>
+      </w:r>
+    </w:p>
+    <w:p>
+      <w:pPr>
+        <w:pStyle w:val="NoSpacing"/>
+        <w:rPr>
+          <w:rFonts w:cstheme="minorHAnsi"/>
+          <w:color w:val="000000"/>
+          <w:sz w:val="24"/>
+          <w:szCs w:val="24"/>
+        </w:rPr>
+      </w:pPr>
+    </w:p>
+    <w:p>
+      <w:pPr>
+        <w:pStyle w:val="NoSpacing"/>
+        <w:rPr>
+          <w:rFonts w:cstheme="minorHAnsi"/>
+          <w:color w:val="000000"/>
+          <w:sz w:val="24"/>
+          <w:szCs w:val="24"/>
+        </w:rPr>
+      </w:pPr>
+      <w:r>
+        <w:rPr>
+          <w:rFonts w:cstheme="minorHAnsi"/>
+          <w:color w:val="000000"/>
+          <w:sz w:val="24"/>
+          <w:szCs w:val="24"/>
+        </w:rPr>
+        <w:t>Then select “Calculate” at Step 4. In a few seconds, your estimates should appear in the graph and table. Select a tab to view results for a given statistic.</w:t>
+      </w:r>
+    </w:p>
+    <w:p>
+      <w:pPr>
+        <w:pStyle w:val="NoSpacing"/>
+        <w:rPr>
+          <w:rFonts w:cstheme="minorHAnsi"/>
+          <w:color w:val="000000"/>
+          <w:sz w:val="24"/>
+          <w:szCs w:val="24"/>
+        </w:rPr>
+      </w:pPr>
+    </w:p>
+    <w:p>
+      <w:pPr>
+        <w:pStyle w:val="Heading1"/>
+      </w:pPr>
+      <w:r>
+        <w:t>Example 2</w:t>
+      </w:r>
+    </w:p>
+    <w:p>
+      <w:pPr>
+        <w:pStyle w:val="NoSpacing"/>
+        <w:rPr>
+          <w:rFonts w:cstheme="minorHAnsi"/>
+          <w:color w:val="000000"/>
+          <w:sz w:val="24"/>
+          <w:szCs w:val="24"/>
+        </w:rPr>
+      </w:pPr>
+      <w:r>
+        <w:rPr>
+          <w:rFonts w:cstheme="minorHAnsi"/>
+          <w:color w:val="000000"/>
+          <w:sz w:val="24"/>
+          <w:szCs w:val="24"/>
+        </w:rPr>
+        <w:t>As a</w:t>
+      </w:r>
+      <w:r>
+        <w:rPr>
+          <w:rFonts w:cstheme="minorHAnsi"/>
+          <w:color w:val="000000"/>
+          <w:sz w:val="24"/>
+          <w:szCs w:val="24"/>
+        </w:rPr>
+        <w:t xml:space="preserve"> second </w:t>
+      </w:r>
+      <w:r>
+        <w:rPr>
+          <w:rFonts w:cstheme="minorHAnsi"/>
+          <w:color w:val="000000"/>
+          <w:sz w:val="24"/>
+          <w:szCs w:val="24"/>
+        </w:rPr>
+        <w:t xml:space="preserve">example, you may be interested in calculating </w:t>
+      </w:r>
+      <w:r>
+        <w:rPr>
+          <w:sz w:val="24"/>
+          <w:szCs w:val="24"/>
+        </w:rPr>
+        <w:t xml:space="preserve">an All-items CPI </w:t>
+      </w:r>
+      <w:r>
+        <w:rPr>
+          <w:sz w:val="24"/>
+          <w:szCs w:val="24"/>
+        </w:rPr>
+        <w:t>across the four Atlantic provinces</w:t>
+      </w:r>
+      <w:r>
+        <w:t>.</w:t>
+      </w:r>
+    </w:p>
+    <w:p>
+      <w:pPr>
+        <w:pStyle w:val="NoSpacing"/>
+        <w:rPr>
+          <w:sz w:val="24"/>
+          <w:szCs w:val="24"/>
+        </w:rPr>
+      </w:pPr>
+    </w:p>
+    <w:p>
+      <w:pPr>
+        <w:pStyle w:val="NoSpacing"/>
+        <w:rPr>
+          <w:rFonts w:cstheme="minorHAnsi"/>
+          <w:color w:val="000000"/>
+          <w:sz w:val="24"/>
+          <w:szCs w:val="24"/>
+        </w:rPr>
+      </w:pPr>
+      <w:r>
+        <w:rPr>
+          <w:sz w:val="24"/>
+          <w:szCs w:val="24"/>
+        </w:rPr>
+        <w:t xml:space="preserve">At Step 1, </w:t>
+      </w:r>
+      <w:r>
+        <w:rPr>
+          <w:rFonts w:cstheme="minorHAnsi"/>
+          <w:color w:val="000000"/>
+          <w:sz w:val="24"/>
+          <w:szCs w:val="24"/>
+        </w:rPr>
+        <w:t xml:space="preserve">select </w:t>
+      </w:r>
+      <w:r>
+        <w:rPr>
+          <w:rFonts w:cstheme="minorHAnsi"/>
+          <w:color w:val="000000"/>
+          <w:sz w:val="24"/>
+          <w:szCs w:val="24"/>
+        </w:rPr>
+        <w:t>“The aggregate of the selected component CPI series”, or “Both of the above”.</w:t>
+      </w:r>
+    </w:p>
+    <w:p>
+      <w:pPr>
+        <w:pStyle w:val="NoSpacing"/>
+        <w:rPr>
+          <w:rFonts w:cstheme="minorHAnsi"/>
+          <w:color w:val="000000"/>
+          <w:sz w:val="24"/>
+          <w:szCs w:val="24"/>
+        </w:rPr>
+      </w:pPr>
+    </w:p>
+    <w:p>
+      <w:pPr>
+        <w:pStyle w:val="NoSpacing"/>
+        <w:rPr>
+          <w:rFonts w:cstheme="minorHAnsi"/>
+          <w:color w:val="000000"/>
+          <w:sz w:val="24"/>
+          <w:szCs w:val="24"/>
+        </w:rPr>
+      </w:pPr>
+      <w:r>
+        <w:rPr>
+          <w:rFonts w:cstheme="minorHAnsi"/>
+          <w:color w:val="000000"/>
+          <w:sz w:val="24"/>
+          <w:szCs w:val="24"/>
+        </w:rPr>
+        <w:t>A</w:t>
+      </w:r>
+      <w:r>
+        <w:rPr>
+          <w:rFonts w:cstheme="minorHAnsi"/>
+          <w:color w:val="000000"/>
+          <w:sz w:val="24"/>
+          <w:szCs w:val="24"/>
+        </w:rPr>
+        <w:t xml:space="preserve">t Step 2, leave the popular aggregation section blank. Under </w:t>
+      </w:r>
+      <w:proofErr w:type="gramStart"/>
+      <w:r>
+        <w:rPr>
+          <w:rFonts w:cstheme="minorHAnsi"/>
+          <w:color w:val="000000"/>
+          <w:sz w:val="24"/>
+          <w:szCs w:val="24"/>
+        </w:rPr>
+        <w:t>“ Select</w:t>
+      </w:r>
+      <w:proofErr w:type="gramEnd"/>
+      <w:r>
+        <w:rPr>
+          <w:rFonts w:cstheme="minorHAnsi"/>
+          <w:color w:val="000000"/>
+          <w:sz w:val="24"/>
+          <w:szCs w:val="24"/>
+        </w:rPr>
+        <w:t xml:space="preserve"> individual component CPI series”, select </w:t>
+      </w:r>
+    </w:p>
+    <w:p>
+      <w:pPr>
+        <w:pStyle w:val="NoSpacing"/>
+        <w:numPr>
+          <w:ilvl w:val="0"/>
+          <w:numId w:val="46"/>
+        </w:numPr>
+        <w:rPr>
+          <w:rFonts w:cstheme="minorHAnsi"/>
+          <w:color w:val="000000"/>
+          <w:sz w:val="24"/>
+          <w:szCs w:val="24"/>
+        </w:rPr>
+      </w:pPr>
+      <w:r>
+        <w:rPr>
+          <w:rFonts w:cstheme="minorHAnsi"/>
+          <w:color w:val="000000"/>
+          <w:sz w:val="24"/>
+          <w:szCs w:val="24"/>
+        </w:rPr>
+        <w:t>Geography = “Newfoundland and Labrador”, Product = “All-items”</w:t>
+      </w:r>
+    </w:p>
+    <w:p>
+      <w:pPr>
+        <w:pStyle w:val="NoSpacing"/>
+        <w:numPr>
+          <w:ilvl w:val="0"/>
+          <w:numId w:val="46"/>
+        </w:numPr>
+        <w:rPr>
+          <w:rFonts w:cstheme="minorHAnsi"/>
+          <w:color w:val="000000"/>
+          <w:sz w:val="24"/>
+          <w:szCs w:val="24"/>
+        </w:rPr>
+      </w:pPr>
+      <w:r>
+        <w:rPr>
+          <w:rFonts w:cstheme="minorHAnsi"/>
+          <w:color w:val="000000"/>
+          <w:sz w:val="24"/>
+          <w:szCs w:val="24"/>
+        </w:rPr>
+        <w:t>Geography = “Prince Edward Island”, Product = “All-items”</w:t>
+      </w:r>
+    </w:p>
+    <w:p>
+      <w:pPr>
+        <w:pStyle w:val="NoSpacing"/>
+        <w:numPr>
+          <w:ilvl w:val="0"/>
+          <w:numId w:val="46"/>
+        </w:numPr>
+        <w:rPr>
+          <w:rFonts w:cstheme="minorHAnsi"/>
+          <w:color w:val="000000"/>
+          <w:sz w:val="24"/>
+          <w:szCs w:val="24"/>
+        </w:rPr>
+      </w:pPr>
+      <w:r>
+        <w:rPr>
+          <w:rFonts w:cstheme="minorHAnsi"/>
+          <w:color w:val="000000"/>
+          <w:sz w:val="24"/>
+          <w:szCs w:val="24"/>
+        </w:rPr>
+        <w:t>Geography = “Nova Scotia”, Product = “All-items”</w:t>
+      </w:r>
+    </w:p>
+    <w:p>
+      <w:pPr>
+        <w:pStyle w:val="NoSpacing"/>
+        <w:numPr>
+          <w:ilvl w:val="0"/>
+          <w:numId w:val="46"/>
+        </w:numPr>
+        <w:rPr>
+          <w:rFonts w:cstheme="minorHAnsi"/>
+          <w:color w:val="000000"/>
+          <w:sz w:val="24"/>
+          <w:szCs w:val="24"/>
+        </w:rPr>
+      </w:pPr>
+      <w:r>
+        <w:rPr>
+          <w:rFonts w:cstheme="minorHAnsi"/>
+          <w:color w:val="000000"/>
+          <w:sz w:val="24"/>
+          <w:szCs w:val="24"/>
+        </w:rPr>
+        <w:t>Geography = “New Brunswick”, Product = “All-items”.</w:t>
+      </w:r>
+    </w:p>
+    <w:p>
+      <w:pPr>
+        <w:pStyle w:val="NoSpacing"/>
+        <w:rPr>
+          <w:rFonts w:cstheme="minorHAnsi"/>
+          <w:color w:val="000000"/>
+          <w:sz w:val="24"/>
+          <w:szCs w:val="24"/>
+        </w:rPr>
+      </w:pPr>
+    </w:p>
+    <w:p>
+      <w:pPr>
+        <w:pStyle w:val="NoSpacing"/>
+        <w:rPr>
+          <w:rFonts w:cstheme="minorHAnsi"/>
+          <w:color w:val="000000"/>
+          <w:sz w:val="24"/>
+          <w:szCs w:val="24"/>
+        </w:rPr>
+      </w:pPr>
+      <w:r>
+        <w:rPr>
+          <w:rFonts w:cstheme="minorHAnsi"/>
+          <w:color w:val="000000"/>
+          <w:sz w:val="24"/>
+          <w:szCs w:val="24"/>
+        </w:rPr>
+        <w:t>At Step 3, select a base period, or leave it at 2007-04 = 100.</w:t>
+      </w:r>
+    </w:p>
+    <w:p>
+      <w:pPr>
+        <w:pStyle w:val="NoSpacing"/>
+        <w:rPr>
+          <w:rFonts w:cstheme="minorHAnsi"/>
+          <w:color w:val="000000"/>
+          <w:sz w:val="24"/>
+          <w:szCs w:val="24"/>
+        </w:rPr>
+      </w:pPr>
+    </w:p>
+    <w:p>
+      <w:pPr>
+        <w:pStyle w:val="NoSpacing"/>
+        <w:rPr>
+          <w:rFonts w:cstheme="minorHAnsi"/>
+          <w:color w:val="000000"/>
+          <w:sz w:val="24"/>
+          <w:szCs w:val="24"/>
+        </w:rPr>
+      </w:pPr>
+      <w:r>
+        <w:rPr>
+          <w:rFonts w:cstheme="minorHAnsi"/>
+          <w:color w:val="000000"/>
+          <w:sz w:val="24"/>
+          <w:szCs w:val="24"/>
+        </w:rPr>
+        <w:t>Then select “Calculate” at Step 4 to view your results.</w:t>
+      </w:r>
+    </w:p>
+    <w:p>
+      <w:pPr>
+        <w:rPr>
+          <w:rFonts w:cstheme="minorHAnsi"/>
+          <w:color w:val="000000"/>
+          <w:sz w:val="24"/>
+          <w:szCs w:val="24"/>
+        </w:rPr>
+      </w:pPr>
+    </w:p>
+    <w:p>
+      <w:pPr>
+        <w:pStyle w:val="Heading1"/>
+      </w:pPr>
+      <w:r>
+        <w:t>Disclaimers</w:t>
       </w:r>
     </w:p>
     <w:p>
@@ -657,37 +1982,33 @@
         </w:numPr>
         <w:rPr>
           <w:rFonts w:cstheme="minorHAnsi"/>
-          <w:color w:val="000000"/>
-          <w:sz w:val="24"/>
-          <w:szCs w:val="24"/>
-        </w:rPr>
-      </w:pPr>
-      <w:r>
-        <w:rPr>
-          <w:rFonts w:cstheme="minorHAnsi"/>
-          <w:color w:val="000000"/>
-          <w:sz w:val="24"/>
-          <w:szCs w:val="24"/>
-        </w:rPr>
-        <w:t>Adjust the graph time range by moving the graph sliders.</w:t>
-      </w:r>
-    </w:p>
-    <w:p>
-      <w:pPr>
-        <w:rPr>
-          <w:rFonts w:cstheme="minorHAnsi"/>
-          <w:color w:val="000000"/>
-          <w:sz w:val="24"/>
-          <w:szCs w:val="24"/>
-        </w:rPr>
-      </w:pPr>
-    </w:p>
-    <w:p>
-      <w:pPr>
-        <w:pStyle w:val="Heading1"/>
-      </w:pPr>
-      <w:r>
-        <w:t>Disclaimers</w:t>
+          <w:sz w:val="24"/>
+          <w:szCs w:val="24"/>
+        </w:rPr>
+      </w:pPr>
+      <w:r>
+        <w:rPr>
+          <w:rFonts w:cstheme="minorHAnsi"/>
+          <w:sz w:val="24"/>
+          <w:szCs w:val="24"/>
+        </w:rPr>
+        <w:t xml:space="preserve">Custom </w:t>
+      </w:r>
+      <w:r>
+        <w:rPr>
+          <w:rFonts w:cstheme="minorHAnsi"/>
+          <w:sz w:val="24"/>
+          <w:szCs w:val="24"/>
+        </w:rPr>
+        <w:t>A</w:t>
+      </w:r>
+      <w:r>
+        <w:rPr>
+          <w:rFonts w:cstheme="minorHAnsi"/>
+          <w:sz w:val="24"/>
+          <w:szCs w:val="24"/>
+        </w:rPr>
+        <w:t xml:space="preserve">ggregate CPIs are provided for informational purposes only and should not be used as substitutes for official Consumer Price Indexes. </w:t>
       </w:r>
     </w:p>
     <w:p>
@@ -709,23 +2030,7 @@
           <w:sz w:val="24"/>
           <w:szCs w:val="24"/>
         </w:rPr>
-        <w:t xml:space="preserve">Custom </w:t>
-      </w:r>
-      <w:r>
-        <w:rPr>
-          <w:rFonts w:cstheme="minorHAnsi"/>
-          <w:sz w:val="24"/>
-          <w:szCs w:val="24"/>
-        </w:rPr>
-        <w:t>A</w:t>
-      </w:r>
-      <w:r>
-        <w:rPr>
-          <w:rFonts w:cstheme="minorHAnsi"/>
-          <w:sz w:val="24"/>
-          <w:szCs w:val="24"/>
-        </w:rPr>
-        <w:t xml:space="preserve">ggregate CPIs are provided for informational purposes only and should not be used as substitutes for official Consumer Price Indexes. </w:t>
+        <w:t>Whereas officially published weights and indexes are calculated from inputs typically containing 16 or more significant digits before rounding, the CPI Custom Aggregate Calculator uses as inputs published weights already rounded to two decimals and indexes rounded to one decimal. Therefore, the values derived using this calculator are approximate and may not be the same as the official numbers due to rounding.</w:t>
       </w:r>
     </w:p>
     <w:p>
@@ -747,28 +2052,7 @@
           <w:sz w:val="24"/>
           <w:szCs w:val="24"/>
         </w:rPr>
-        <w:t>Whereas officially published weights and indexes are calculated from inputs typically containing 16 or more significant digits before rounding, the CPI Custom Aggregate Calculator uses as inputs published weights already rounded to two decimals and indexes rounded to one decimal. Therefore, the values derived using this calculator are approximate and may not be the same as the official numbers due to rounding.</w:t>
-      </w:r>
-    </w:p>
-    <w:p>
-      <w:pPr>
-        <w:pStyle w:val="NoSpacing"/>
-        <w:numPr>
-          <w:ilvl w:val="0"/>
-          <w:numId w:val="4"/>
-        </w:numPr>
-        <w:rPr>
-          <w:rFonts w:cstheme="minorHAnsi"/>
-          <w:sz w:val="24"/>
-          <w:szCs w:val="24"/>
-        </w:rPr>
-      </w:pPr>
-      <w:r>
-        <w:rPr>
-          <w:rFonts w:cstheme="minorHAnsi"/>
-          <w:sz w:val="24"/>
-          <w:szCs w:val="24"/>
-        </w:rPr>
+        <w:lastRenderedPageBreak/>
         <w:t>The set of geographies, products and base periods used to generate the data was made by the author or authors and the responsibility for the use and interpretation of these data is entirely that of the author or authors.</w:t>
       </w:r>
     </w:p>
@@ -933,39 +2217,6 @@
           <w:sz w:val="24"/>
           <w:szCs w:val="24"/>
         </w:rPr>
-        <w:t xml:space="preserve">The CPI Custom Aggregate Calculator uses your selections to determine which series to display for each statistic. Email us at statcan.cpddisseminationunit-dpcunitedediffusion.statcan@statcan.gc.ca for further details on which series will be </w:t>
-      </w:r>
-      <w:proofErr w:type="spellStart"/>
-      <w:r>
-        <w:rPr>
-          <w:rFonts w:cstheme="minorHAnsi"/>
-          <w:sz w:val="24"/>
-          <w:szCs w:val="24"/>
-        </w:rPr>
-        <w:t>displayed.</w:t>
-      </w:r>
-      <w:proofErr w:type="spellEnd"/>
-    </w:p>
-    <w:p>
-      <w:pPr>
-        <w:pStyle w:val="NoSpacing"/>
-        <w:numPr>
-          <w:ilvl w:val="0"/>
-          <w:numId w:val="44"/>
-        </w:numPr>
-        <w:rPr>
-          <w:rFonts w:cstheme="minorHAnsi"/>
-          <w:sz w:val="24"/>
-          <w:szCs w:val="24"/>
-        </w:rPr>
-      </w:pPr>
-      <w:r>
-        <w:rPr>
-          <w:rFonts w:cstheme="minorHAnsi"/>
-          <w:sz w:val="24"/>
-          <w:szCs w:val="24"/>
-        </w:rPr>
-        <w:lastRenderedPageBreak/>
         <w:t xml:space="preserve">The CPI Custom Aggregate Calculator performs calculations </w:t>
       </w:r>
       <w:proofErr w:type="gramStart"/>
@@ -4312,6 +5563,119 @@
     </w:lvl>
   </w:abstractNum>
   <w:abstractNum w:abstractNumId="25" w15:restartNumberingAfterBreak="0">
+    <w:nsid w:val="545D4CD7"/>
+    <w:multiLevelType w:val="hybridMultilevel"/>
+    <w:tmpl w:val="164EEE60"/>
+    <w:lvl w:ilvl="0" w:tplc="04090001">
+      <w:start w:val="1"/>
+      <w:numFmt w:val="bullet"/>
+      <w:lvlText w:val=""/>
+      <w:lvlJc w:val="left"/>
+      <w:pPr>
+        <w:ind w:left="720" w:hanging="360"/>
+      </w:pPr>
+      <w:rPr>
+        <w:rFonts w:ascii="Symbol" w:hAnsi="Symbol" w:hint="default"/>
+      </w:rPr>
+    </w:lvl>
+    <w:lvl w:ilvl="1" w:tplc="04090003" w:tentative="1">
+      <w:start w:val="1"/>
+      <w:numFmt w:val="bullet"/>
+      <w:lvlText w:val="o"/>
+      <w:lvlJc w:val="left"/>
+      <w:pPr>
+        <w:ind w:left="1440" w:hanging="360"/>
+      </w:pPr>
+      <w:rPr>
+        <w:rFonts w:ascii="Courier New" w:hAnsi="Courier New" w:cs="Courier New" w:hint="default"/>
+      </w:rPr>
+    </w:lvl>
+    <w:lvl w:ilvl="2" w:tplc="04090005" w:tentative="1">
+      <w:start w:val="1"/>
+      <w:numFmt w:val="bullet"/>
+      <w:lvlText w:val=""/>
+      <w:lvlJc w:val="left"/>
+      <w:pPr>
+        <w:ind w:left="2160" w:hanging="360"/>
+      </w:pPr>
+      <w:rPr>
+        <w:rFonts w:ascii="Wingdings" w:hAnsi="Wingdings" w:hint="default"/>
+      </w:rPr>
+    </w:lvl>
+    <w:lvl w:ilvl="3" w:tplc="04090001" w:tentative="1">
+      <w:start w:val="1"/>
+      <w:numFmt w:val="bullet"/>
+      <w:lvlText w:val=""/>
+      <w:lvlJc w:val="left"/>
+      <w:pPr>
+        <w:ind w:left="2880" w:hanging="360"/>
+      </w:pPr>
+      <w:rPr>
+        <w:rFonts w:ascii="Symbol" w:hAnsi="Symbol" w:hint="default"/>
+      </w:rPr>
+    </w:lvl>
+    <w:lvl w:ilvl="4" w:tplc="04090003" w:tentative="1">
+      <w:start w:val="1"/>
+      <w:numFmt w:val="bullet"/>
+      <w:lvlText w:val="o"/>
+      <w:lvlJc w:val="left"/>
+      <w:pPr>
+        <w:ind w:left="3600" w:hanging="360"/>
+      </w:pPr>
+      <w:rPr>
+        <w:rFonts w:ascii="Courier New" w:hAnsi="Courier New" w:cs="Courier New" w:hint="default"/>
+      </w:rPr>
+    </w:lvl>
+    <w:lvl w:ilvl="5" w:tplc="04090005" w:tentative="1">
+      <w:start w:val="1"/>
+      <w:numFmt w:val="bullet"/>
+      <w:lvlText w:val=""/>
+      <w:lvlJc w:val="left"/>
+      <w:pPr>
+        <w:ind w:left="4320" w:hanging="360"/>
+      </w:pPr>
+      <w:rPr>
+        <w:rFonts w:ascii="Wingdings" w:hAnsi="Wingdings" w:hint="default"/>
+      </w:rPr>
+    </w:lvl>
+    <w:lvl w:ilvl="6" w:tplc="04090001" w:tentative="1">
+      <w:start w:val="1"/>
+      <w:numFmt w:val="bullet"/>
+      <w:lvlText w:val=""/>
+      <w:lvlJc w:val="left"/>
+      <w:pPr>
+        <w:ind w:left="5040" w:hanging="360"/>
+      </w:pPr>
+      <w:rPr>
+        <w:rFonts w:ascii="Symbol" w:hAnsi="Symbol" w:hint="default"/>
+      </w:rPr>
+    </w:lvl>
+    <w:lvl w:ilvl="7" w:tplc="04090003" w:tentative="1">
+      <w:start w:val="1"/>
+      <w:numFmt w:val="bullet"/>
+      <w:lvlText w:val="o"/>
+      <w:lvlJc w:val="left"/>
+      <w:pPr>
+        <w:ind w:left="5760" w:hanging="360"/>
+      </w:pPr>
+      <w:rPr>
+        <w:rFonts w:ascii="Courier New" w:hAnsi="Courier New" w:cs="Courier New" w:hint="default"/>
+      </w:rPr>
+    </w:lvl>
+    <w:lvl w:ilvl="8" w:tplc="04090005" w:tentative="1">
+      <w:start w:val="1"/>
+      <w:numFmt w:val="bullet"/>
+      <w:lvlText w:val=""/>
+      <w:lvlJc w:val="left"/>
+      <w:pPr>
+        <w:ind w:left="6480" w:hanging="360"/>
+      </w:pPr>
+      <w:rPr>
+        <w:rFonts w:ascii="Wingdings" w:hAnsi="Wingdings" w:hint="default"/>
+      </w:rPr>
+    </w:lvl>
+  </w:abstractNum>
+  <w:abstractNum w:abstractNumId="26" w15:restartNumberingAfterBreak="0">
     <w:nsid w:val="5C380963"/>
     <w:multiLevelType w:val="multilevel"/>
     <w:tmpl w:val="A59CC158"/>
@@ -4460,7 +5824,7 @@
       </w:rPr>
     </w:lvl>
   </w:abstractNum>
-  <w:abstractNum w:abstractNumId="26" w15:restartNumberingAfterBreak="0">
+  <w:abstractNum w:abstractNumId="27" w15:restartNumberingAfterBreak="0">
     <w:nsid w:val="5E7500F1"/>
     <w:multiLevelType w:val="hybridMultilevel"/>
     <w:tmpl w:val="B128F780"/>
@@ -4573,7 +5937,120 @@
       </w:rPr>
     </w:lvl>
   </w:abstractNum>
-  <w:abstractNum w:abstractNumId="27" w15:restartNumberingAfterBreak="0">
+  <w:abstractNum w:abstractNumId="28" w15:restartNumberingAfterBreak="0">
+    <w:nsid w:val="616520BC"/>
+    <w:multiLevelType w:val="hybridMultilevel"/>
+    <w:tmpl w:val="27B486FE"/>
+    <w:lvl w:ilvl="0" w:tplc="04090001">
+      <w:start w:val="1"/>
+      <w:numFmt w:val="bullet"/>
+      <w:lvlText w:val=""/>
+      <w:lvlJc w:val="left"/>
+      <w:pPr>
+        <w:ind w:left="720" w:hanging="360"/>
+      </w:pPr>
+      <w:rPr>
+        <w:rFonts w:ascii="Symbol" w:hAnsi="Symbol" w:hint="default"/>
+      </w:rPr>
+    </w:lvl>
+    <w:lvl w:ilvl="1" w:tplc="04090003" w:tentative="1">
+      <w:start w:val="1"/>
+      <w:numFmt w:val="bullet"/>
+      <w:lvlText w:val="o"/>
+      <w:lvlJc w:val="left"/>
+      <w:pPr>
+        <w:ind w:left="1440" w:hanging="360"/>
+      </w:pPr>
+      <w:rPr>
+        <w:rFonts w:ascii="Courier New" w:hAnsi="Courier New" w:cs="Courier New" w:hint="default"/>
+      </w:rPr>
+    </w:lvl>
+    <w:lvl w:ilvl="2" w:tplc="04090005" w:tentative="1">
+      <w:start w:val="1"/>
+      <w:numFmt w:val="bullet"/>
+      <w:lvlText w:val=""/>
+      <w:lvlJc w:val="left"/>
+      <w:pPr>
+        <w:ind w:left="2160" w:hanging="360"/>
+      </w:pPr>
+      <w:rPr>
+        <w:rFonts w:ascii="Wingdings" w:hAnsi="Wingdings" w:hint="default"/>
+      </w:rPr>
+    </w:lvl>
+    <w:lvl w:ilvl="3" w:tplc="04090001" w:tentative="1">
+      <w:start w:val="1"/>
+      <w:numFmt w:val="bullet"/>
+      <w:lvlText w:val=""/>
+      <w:lvlJc w:val="left"/>
+      <w:pPr>
+        <w:ind w:left="2880" w:hanging="360"/>
+      </w:pPr>
+      <w:rPr>
+        <w:rFonts w:ascii="Symbol" w:hAnsi="Symbol" w:hint="default"/>
+      </w:rPr>
+    </w:lvl>
+    <w:lvl w:ilvl="4" w:tplc="04090003" w:tentative="1">
+      <w:start w:val="1"/>
+      <w:numFmt w:val="bullet"/>
+      <w:lvlText w:val="o"/>
+      <w:lvlJc w:val="left"/>
+      <w:pPr>
+        <w:ind w:left="3600" w:hanging="360"/>
+      </w:pPr>
+      <w:rPr>
+        <w:rFonts w:ascii="Courier New" w:hAnsi="Courier New" w:cs="Courier New" w:hint="default"/>
+      </w:rPr>
+    </w:lvl>
+    <w:lvl w:ilvl="5" w:tplc="04090005" w:tentative="1">
+      <w:start w:val="1"/>
+      <w:numFmt w:val="bullet"/>
+      <w:lvlText w:val=""/>
+      <w:lvlJc w:val="left"/>
+      <w:pPr>
+        <w:ind w:left="4320" w:hanging="360"/>
+      </w:pPr>
+      <w:rPr>
+        <w:rFonts w:ascii="Wingdings" w:hAnsi="Wingdings" w:hint="default"/>
+      </w:rPr>
+    </w:lvl>
+    <w:lvl w:ilvl="6" w:tplc="04090001" w:tentative="1">
+      <w:start w:val="1"/>
+      <w:numFmt w:val="bullet"/>
+      <w:lvlText w:val=""/>
+      <w:lvlJc w:val="left"/>
+      <w:pPr>
+        <w:ind w:left="5040" w:hanging="360"/>
+      </w:pPr>
+      <w:rPr>
+        <w:rFonts w:ascii="Symbol" w:hAnsi="Symbol" w:hint="default"/>
+      </w:rPr>
+    </w:lvl>
+    <w:lvl w:ilvl="7" w:tplc="04090003" w:tentative="1">
+      <w:start w:val="1"/>
+      <w:numFmt w:val="bullet"/>
+      <w:lvlText w:val="o"/>
+      <w:lvlJc w:val="left"/>
+      <w:pPr>
+        <w:ind w:left="5760" w:hanging="360"/>
+      </w:pPr>
+      <w:rPr>
+        <w:rFonts w:ascii="Courier New" w:hAnsi="Courier New" w:cs="Courier New" w:hint="default"/>
+      </w:rPr>
+    </w:lvl>
+    <w:lvl w:ilvl="8" w:tplc="04090005" w:tentative="1">
+      <w:start w:val="1"/>
+      <w:numFmt w:val="bullet"/>
+      <w:lvlText w:val=""/>
+      <w:lvlJc w:val="left"/>
+      <w:pPr>
+        <w:ind w:left="6480" w:hanging="360"/>
+      </w:pPr>
+      <w:rPr>
+        <w:rFonts w:ascii="Wingdings" w:hAnsi="Wingdings" w:hint="default"/>
+      </w:rPr>
+    </w:lvl>
+  </w:abstractNum>
+  <w:abstractNum w:abstractNumId="29" w15:restartNumberingAfterBreak="0">
     <w:nsid w:val="63797677"/>
     <w:multiLevelType w:val="multilevel"/>
     <w:tmpl w:val="E550C382"/>
@@ -4722,7 +6199,7 @@
       </w:rPr>
     </w:lvl>
   </w:abstractNum>
-  <w:abstractNum w:abstractNumId="28" w15:restartNumberingAfterBreak="0">
+  <w:abstractNum w:abstractNumId="30" w15:restartNumberingAfterBreak="0">
     <w:nsid w:val="67CD6467"/>
     <w:multiLevelType w:val="multilevel"/>
     <w:tmpl w:val="946C574C"/>
@@ -4861,7 +6338,7 @@
       </w:rPr>
     </w:lvl>
   </w:abstractNum>
-  <w:abstractNum w:abstractNumId="29" w15:restartNumberingAfterBreak="0">
+  <w:abstractNum w:abstractNumId="31" w15:restartNumberingAfterBreak="0">
     <w:nsid w:val="69262C0C"/>
     <w:multiLevelType w:val="hybridMultilevel"/>
     <w:tmpl w:val="0A6633EA"/>
@@ -4974,7 +6451,7 @@
       </w:rPr>
     </w:lvl>
   </w:abstractNum>
-  <w:abstractNum w:abstractNumId="30" w15:restartNumberingAfterBreak="0">
+  <w:abstractNum w:abstractNumId="32" w15:restartNumberingAfterBreak="0">
     <w:nsid w:val="69C63011"/>
     <w:multiLevelType w:val="hybridMultilevel"/>
     <w:tmpl w:val="C7709740"/>
@@ -5063,7 +6540,7 @@
       </w:pPr>
     </w:lvl>
   </w:abstractNum>
-  <w:abstractNum w:abstractNumId="31" w15:restartNumberingAfterBreak="0">
+  <w:abstractNum w:abstractNumId="33" w15:restartNumberingAfterBreak="0">
     <w:nsid w:val="6B6675FF"/>
     <w:multiLevelType w:val="multilevel"/>
     <w:tmpl w:val="D01AF4E8"/>
@@ -5181,7 +6658,7 @@
       </w:pPr>
     </w:lvl>
   </w:abstractNum>
-  <w:abstractNum w:abstractNumId="32" w15:restartNumberingAfterBreak="0">
+  <w:abstractNum w:abstractNumId="34" w15:restartNumberingAfterBreak="0">
     <w:nsid w:val="6DA47725"/>
     <w:multiLevelType w:val="multilevel"/>
     <w:tmpl w:val="8034EA78"/>
@@ -5294,7 +6771,7 @@
       </w:pPr>
     </w:lvl>
   </w:abstractNum>
-  <w:abstractNum w:abstractNumId="33" w15:restartNumberingAfterBreak="0">
+  <w:abstractNum w:abstractNumId="35" w15:restartNumberingAfterBreak="0">
     <w:nsid w:val="71A75713"/>
     <w:multiLevelType w:val="multilevel"/>
     <w:tmpl w:val="8E3E4300"/>
@@ -5443,7 +6920,7 @@
       </w:rPr>
     </w:lvl>
   </w:abstractNum>
-  <w:abstractNum w:abstractNumId="34" w15:restartNumberingAfterBreak="0">
+  <w:abstractNum w:abstractNumId="36" w15:restartNumberingAfterBreak="0">
     <w:nsid w:val="74F06F7E"/>
     <w:multiLevelType w:val="hybridMultilevel"/>
     <w:tmpl w:val="C7709740"/>
@@ -5532,7 +7009,7 @@
       </w:pPr>
     </w:lvl>
   </w:abstractNum>
-  <w:abstractNum w:abstractNumId="35" w15:restartNumberingAfterBreak="0">
+  <w:abstractNum w:abstractNumId="37" w15:restartNumberingAfterBreak="0">
     <w:nsid w:val="780B0C3D"/>
     <w:multiLevelType w:val="multilevel"/>
     <w:tmpl w:val="7C427B2C"/>
@@ -5650,7 +7127,7 @@
       </w:pPr>
     </w:lvl>
   </w:abstractNum>
-  <w:abstractNum w:abstractNumId="36" w15:restartNumberingAfterBreak="0">
+  <w:abstractNum w:abstractNumId="38" w15:restartNumberingAfterBreak="0">
     <w:nsid w:val="78A943CE"/>
     <w:multiLevelType w:val="multilevel"/>
     <w:tmpl w:val="05EA4266"/>
@@ -5799,7 +7276,7 @@
       </w:rPr>
     </w:lvl>
   </w:abstractNum>
-  <w:abstractNum w:abstractNumId="37" w15:restartNumberingAfterBreak="0">
+  <w:abstractNum w:abstractNumId="39" w15:restartNumberingAfterBreak="0">
     <w:nsid w:val="7EAD75F6"/>
     <w:multiLevelType w:val="multilevel"/>
     <w:tmpl w:val="8034EA78"/>
@@ -5919,22 +7396,22 @@
     <w:abstractNumId w:val="12"/>
   </w:num>
   <w:num w:numId="3" w16cid:durableId="143393079">
-    <w:abstractNumId w:val="26"/>
+    <w:abstractNumId w:val="27"/>
   </w:num>
   <w:num w:numId="4" w16cid:durableId="1043748725">
     <w:abstractNumId w:val="0"/>
   </w:num>
   <w:num w:numId="5" w16cid:durableId="1930042180">
-    <w:abstractNumId w:val="30"/>
+    <w:abstractNumId w:val="32"/>
   </w:num>
   <w:num w:numId="6" w16cid:durableId="2041275705">
-    <w:abstractNumId w:val="29"/>
+    <w:abstractNumId w:val="31"/>
   </w:num>
   <w:num w:numId="7" w16cid:durableId="1881434855">
     <w:abstractNumId w:val="5"/>
   </w:num>
   <w:num w:numId="8" w16cid:durableId="1788767419">
-    <w:abstractNumId w:val="37"/>
+    <w:abstractNumId w:val="39"/>
   </w:num>
   <w:num w:numId="9" w16cid:durableId="101345399">
     <w:abstractNumId w:val="3"/>
@@ -5952,7 +7429,7 @@
     <w:abstractNumId w:val="24"/>
   </w:num>
   <w:num w:numId="14" w16cid:durableId="1101025392">
-    <w:abstractNumId w:val="33"/>
+    <w:abstractNumId w:val="35"/>
   </w:num>
   <w:num w:numId="15" w16cid:durableId="1213420634">
     <w:abstractNumId w:val="8"/>
@@ -5988,19 +7465,19 @@
     </w:lvlOverride>
   </w:num>
   <w:num w:numId="19" w16cid:durableId="915477935">
-    <w:abstractNumId w:val="25"/>
+    <w:abstractNumId w:val="26"/>
   </w:num>
   <w:num w:numId="20" w16cid:durableId="150677133">
     <w:abstractNumId w:val="13"/>
   </w:num>
   <w:num w:numId="21" w16cid:durableId="1385332240">
-    <w:abstractNumId w:val="36"/>
+    <w:abstractNumId w:val="38"/>
   </w:num>
   <w:num w:numId="22" w16cid:durableId="2067295649">
     <w:abstractNumId w:val="21"/>
   </w:num>
   <w:num w:numId="23" w16cid:durableId="277103963">
-    <w:abstractNumId w:val="27"/>
+    <w:abstractNumId w:val="29"/>
   </w:num>
   <w:num w:numId="24" w16cid:durableId="416561999">
     <w:abstractNumId w:val="9"/>
@@ -6045,13 +7522,13 @@
     <w:abstractNumId w:val="6"/>
   </w:num>
   <w:num w:numId="31" w16cid:durableId="580484842">
-    <w:abstractNumId w:val="35"/>
+    <w:abstractNumId w:val="37"/>
   </w:num>
   <w:num w:numId="32" w16cid:durableId="1154638777">
     <w:abstractNumId w:val="4"/>
   </w:num>
   <w:num w:numId="33" w16cid:durableId="213199216">
-    <w:abstractNumId w:val="31"/>
+    <w:abstractNumId w:val="33"/>
   </w:num>
   <w:num w:numId="34" w16cid:durableId="450630270">
     <w:abstractNumId w:val="7"/>
@@ -6069,22 +7546,28 @@
     <w:abstractNumId w:val="10"/>
   </w:num>
   <w:num w:numId="39" w16cid:durableId="2035375879">
-    <w:abstractNumId w:val="28"/>
+    <w:abstractNumId w:val="30"/>
   </w:num>
   <w:num w:numId="40" w16cid:durableId="1276329126">
     <w:abstractNumId w:val="17"/>
   </w:num>
   <w:num w:numId="41" w16cid:durableId="2070690805">
-    <w:abstractNumId w:val="34"/>
+    <w:abstractNumId w:val="36"/>
   </w:num>
   <w:num w:numId="42" w16cid:durableId="934748190">
     <w:abstractNumId w:val="14"/>
   </w:num>
   <w:num w:numId="43" w16cid:durableId="588853002">
-    <w:abstractNumId w:val="32"/>
+    <w:abstractNumId w:val="34"/>
   </w:num>
   <w:num w:numId="44" w16cid:durableId="1303998889">
     <w:abstractNumId w:val="15"/>
+  </w:num>
+  <w:num w:numId="45" w16cid:durableId="1647969198">
+    <w:abstractNumId w:val="28"/>
+  </w:num>
+  <w:num w:numId="46" w16cid:durableId="1629511845">
+    <w:abstractNumId w:val="25"/>
   </w:num>
 </w:numbering>
 </file>

</xml_diff>